<commit_message>
feat(viceri-study): publish specification and test suite v1.3
</commit_message>
<xml_diff>
--- a/output/docx/AdministradorAdicionaAdministrador.docx
+++ b/output/docx/AdministradorAdicionaAdministrador.docx
@@ -303,7 +303,7 @@
               <w:rPr>
                 <w:sz w:val="18"/>
               </w:rPr>
-              <w:t>SYSTEM notifica que o Administrador foi adicionado com sucesso e exibe lista de Administradores</w:t>
+              <w:t>SYSTEM notifica que o Administrador foi adicionado com sucesso</w:t>
             </w:r>
           </w:p>
         </w:tc>
@@ -621,7 +621,7 @@
               <w:rPr>
                 <w:sz w:val="18"/>
               </w:rPr>
-              <w:t>SYSTEM notifica que o Administrador foi adicionado com sucesso e exibe lista de Administradores</w:t>
+              <w:t>SYSTEM notifica que o Administrador foi adicionado com sucesso</w:t>
             </w:r>
           </w:p>
         </w:tc>
@@ -939,7 +939,7 @@
               <w:rPr>
                 <w:sz w:val="18"/>
               </w:rPr>
-              <w:t>SYSTEM notifica que o Administrador foi adicionado com sucesso e exibe lista de Administradores</w:t>
+              <w:t>SYSTEM notifica que o Administrador foi adicionado com sucesso</w:t>
             </w:r>
           </w:p>
         </w:tc>

</xml_diff>